<commit_message>
fix: rename DiscountController to DiscountMasterController
</commit_message>
<xml_diff>
--- a/blueprint/DRAFT_Blueprint_ERP_Master_Data_CWA.docx
+++ b/blueprint/DRAFT_Blueprint_ERP_Master_Data_CWA.docx
@@ -15068,6 +15068,98 @@
           <w:lang w:val="en-US"/>
         </w:rPr>
       </w:pPr>
+      <w:r>
+        <w:rPr>
+          <w:noProof/>
+        </w:rPr>
+        <w:drawing>
+          <wp:inline distT="0" distB="0" distL="0" distR="0" wp14:anchorId="5849E516" wp14:editId="1BB13F79">
+            <wp:extent cx="4725670" cy="2176629"/>
+            <wp:effectExtent l="0" t="0" r="0" b="0"/>
+            <wp:docPr id="893490764" name="Picture 1"/>
+            <wp:cNvGraphicFramePr>
+              <a:graphicFrameLocks xmlns:a="http://schemas.openxmlformats.org/drawingml/2006/main" noChangeAspect="1"/>
+            </wp:cNvGraphicFramePr>
+            <a:graphic xmlns:a="http://schemas.openxmlformats.org/drawingml/2006/main">
+              <a:graphicData uri="http://schemas.openxmlformats.org/drawingml/2006/picture">
+                <pic:pic xmlns:pic="http://schemas.openxmlformats.org/drawingml/2006/picture">
+                  <pic:nvPicPr>
+                    <pic:cNvPr id="893490764" name=""/>
+                    <pic:cNvPicPr/>
+                  </pic:nvPicPr>
+                  <pic:blipFill>
+                    <a:blip r:embed="rId24"/>
+                    <a:stretch>
+                      <a:fillRect/>
+                    </a:stretch>
+                  </pic:blipFill>
+                  <pic:spPr>
+                    <a:xfrm>
+                      <a:off x="0" y="0"/>
+                      <a:ext cx="4734474" cy="2180684"/>
+                    </a:xfrm>
+                    <a:prstGeom prst="rect">
+                      <a:avLst/>
+                    </a:prstGeom>
+                  </pic:spPr>
+                </pic:pic>
+              </a:graphicData>
+            </a:graphic>
+          </wp:inline>
+        </w:drawing>
+      </w:r>
+    </w:p>
+    <w:p>
+      <w:pPr>
+        <w:spacing w:line="360" w:lineRule="auto"/>
+        <w:ind w:left="1728"/>
+        <w:rPr>
+          <w:sz w:val="24"/>
+          <w:szCs w:val="24"/>
+          <w:lang w:val="en-US"/>
+        </w:rPr>
+      </w:pPr>
+      <w:r>
+        <w:rPr>
+          <w:noProof/>
+        </w:rPr>
+        <w:lastRenderedPageBreak/>
+        <w:drawing>
+          <wp:inline distT="0" distB="0" distL="0" distR="0" wp14:anchorId="2D72A140" wp14:editId="42611453">
+            <wp:extent cx="4256405" cy="3239250"/>
+            <wp:effectExtent l="0" t="0" r="0" b="0"/>
+            <wp:docPr id="180295588" name="Picture 1"/>
+            <wp:cNvGraphicFramePr>
+              <a:graphicFrameLocks xmlns:a="http://schemas.openxmlformats.org/drawingml/2006/main" noChangeAspect="1"/>
+            </wp:cNvGraphicFramePr>
+            <a:graphic xmlns:a="http://schemas.openxmlformats.org/drawingml/2006/main">
+              <a:graphicData uri="http://schemas.openxmlformats.org/drawingml/2006/picture">
+                <pic:pic xmlns:pic="http://schemas.openxmlformats.org/drawingml/2006/picture">
+                  <pic:nvPicPr>
+                    <pic:cNvPr id="180295588" name=""/>
+                    <pic:cNvPicPr/>
+                  </pic:nvPicPr>
+                  <pic:blipFill>
+                    <a:blip r:embed="rId25"/>
+                    <a:stretch>
+                      <a:fillRect/>
+                    </a:stretch>
+                  </pic:blipFill>
+                  <pic:spPr>
+                    <a:xfrm>
+                      <a:off x="0" y="0"/>
+                      <a:ext cx="4258042" cy="3240496"/>
+                    </a:xfrm>
+                    <a:prstGeom prst="rect">
+                      <a:avLst/>
+                    </a:prstGeom>
+                  </pic:spPr>
+                </pic:pic>
+              </a:graphicData>
+            </a:graphic>
+          </wp:inline>
+        </w:drawing>
+      </w:r>
     </w:p>
     <w:p>
       <w:pPr>
@@ -15697,6 +15789,98 @@
           <w:lang w:val="en-US"/>
         </w:rPr>
       </w:pPr>
+      <w:r>
+        <w:rPr>
+          <w:noProof/>
+        </w:rPr>
+        <w:drawing>
+          <wp:inline distT="0" distB="0" distL="0" distR="0" wp14:anchorId="53C07250" wp14:editId="542D0070">
+            <wp:extent cx="5163820" cy="2323996"/>
+            <wp:effectExtent l="0" t="0" r="0" b="635"/>
+            <wp:docPr id="1834252236" name="Picture 1"/>
+            <wp:cNvGraphicFramePr>
+              <a:graphicFrameLocks xmlns:a="http://schemas.openxmlformats.org/drawingml/2006/main" noChangeAspect="1"/>
+            </wp:cNvGraphicFramePr>
+            <a:graphic xmlns:a="http://schemas.openxmlformats.org/drawingml/2006/main">
+              <a:graphicData uri="http://schemas.openxmlformats.org/drawingml/2006/picture">
+                <pic:pic xmlns:pic="http://schemas.openxmlformats.org/drawingml/2006/picture">
+                  <pic:nvPicPr>
+                    <pic:cNvPr id="1834252236" name=""/>
+                    <pic:cNvPicPr/>
+                  </pic:nvPicPr>
+                  <pic:blipFill>
+                    <a:blip r:embed="rId26"/>
+                    <a:stretch>
+                      <a:fillRect/>
+                    </a:stretch>
+                  </pic:blipFill>
+                  <pic:spPr>
+                    <a:xfrm>
+                      <a:off x="0" y="0"/>
+                      <a:ext cx="5170314" cy="2326919"/>
+                    </a:xfrm>
+                    <a:prstGeom prst="rect">
+                      <a:avLst/>
+                    </a:prstGeom>
+                  </pic:spPr>
+                </pic:pic>
+              </a:graphicData>
+            </a:graphic>
+          </wp:inline>
+        </w:drawing>
+      </w:r>
+    </w:p>
+    <w:p>
+      <w:pPr>
+        <w:spacing w:line="360" w:lineRule="auto"/>
+        <w:ind w:left="1728"/>
+        <w:rPr>
+          <w:sz w:val="24"/>
+          <w:szCs w:val="24"/>
+          <w:lang w:val="en-US"/>
+        </w:rPr>
+      </w:pPr>
+      <w:r>
+        <w:rPr>
+          <w:noProof/>
+        </w:rPr>
+        <w:lastRenderedPageBreak/>
+        <w:drawing>
+          <wp:inline distT="0" distB="0" distL="0" distR="0" wp14:anchorId="3FB72516" wp14:editId="2F7ACCD8">
+            <wp:extent cx="3475355" cy="2455414"/>
+            <wp:effectExtent l="0" t="0" r="0" b="2540"/>
+            <wp:docPr id="2033979138" name="Picture 1"/>
+            <wp:cNvGraphicFramePr>
+              <a:graphicFrameLocks xmlns:a="http://schemas.openxmlformats.org/drawingml/2006/main" noChangeAspect="1"/>
+            </wp:cNvGraphicFramePr>
+            <a:graphic xmlns:a="http://schemas.openxmlformats.org/drawingml/2006/main">
+              <a:graphicData uri="http://schemas.openxmlformats.org/drawingml/2006/picture">
+                <pic:pic xmlns:pic="http://schemas.openxmlformats.org/drawingml/2006/picture">
+                  <pic:nvPicPr>
+                    <pic:cNvPr id="2033979138" name=""/>
+                    <pic:cNvPicPr/>
+                  </pic:nvPicPr>
+                  <pic:blipFill>
+                    <a:blip r:embed="rId27"/>
+                    <a:stretch>
+                      <a:fillRect/>
+                    </a:stretch>
+                  </pic:blipFill>
+                  <pic:spPr>
+                    <a:xfrm>
+                      <a:off x="0" y="0"/>
+                      <a:ext cx="3478111" cy="2457361"/>
+                    </a:xfrm>
+                    <a:prstGeom prst="rect">
+                      <a:avLst/>
+                    </a:prstGeom>
+                  </pic:spPr>
+                </pic:pic>
+              </a:graphicData>
+            </a:graphic>
+          </wp:inline>
+        </w:drawing>
+      </w:r>
     </w:p>
     <w:p>
       <w:pPr>
@@ -16321,16 +16505,7 @@
           <w:szCs w:val="24"/>
           <w:lang w:val="en-US"/>
         </w:rPr>
-        <w:t xml:space="preserve"> </w:t>
-      </w:r>
-      <w:r>
-        <w:rPr>
-          <w:sz w:val="24"/>
-          <w:szCs w:val="24"/>
-          <w:lang w:val="en-US"/>
-        </w:rPr>
-        <w:lastRenderedPageBreak/>
-        <w:t xml:space="preserve">edit </w:t>
+        <w:t xml:space="preserve"> edit </w:t>
       </w:r>
       <w:proofErr w:type="spellStart"/>
       <w:r>
@@ -17743,6 +17918,7 @@
           <w:szCs w:val="24"/>
           <w:lang w:val="en-US"/>
         </w:rPr>
+        <w:lastRenderedPageBreak/>
         <w:t>Komponen</w:t>
       </w:r>
       <w:proofErr w:type="spellEnd"/>
@@ -19213,16 +19389,7 @@
           <w:szCs w:val="24"/>
           <w:lang w:val="en-US"/>
         </w:rPr>
-        <w:t xml:space="preserve">, Name, Customer, </w:t>
-      </w:r>
-      <w:r>
-        <w:rPr>
-          <w:sz w:val="24"/>
-          <w:szCs w:val="24"/>
-          <w:lang w:val="en-US"/>
-        </w:rPr>
-        <w:lastRenderedPageBreak/>
-        <w:t xml:space="preserve">Product, </w:t>
+        <w:t xml:space="preserve">, Name, Customer, Product, </w:t>
       </w:r>
       <w:proofErr w:type="spellStart"/>
       <w:r>
@@ -20509,6 +20676,7 @@
           <w:szCs w:val="24"/>
           <w:lang w:val="en-US"/>
         </w:rPr>
+        <w:lastRenderedPageBreak/>
         <w:t>Product Price Log</w:t>
       </w:r>
       <w:r>
@@ -22136,7 +22304,6 @@
           <w:szCs w:val="24"/>
           <w:lang w:val="en-US"/>
         </w:rPr>
-        <w:lastRenderedPageBreak/>
         <w:t>memunculkan</w:t>
       </w:r>
       <w:proofErr w:type="spellEnd"/>
@@ -26864,7 +27031,16 @@
           <w:szCs w:val="24"/>
           <w:lang w:val="en-US"/>
         </w:rPr>
-        <w:t xml:space="preserve"> pop-up form Name, </w:t>
+        <w:t xml:space="preserve"> pop-up form </w:t>
+      </w:r>
+      <w:r>
+        <w:rPr>
+          <w:sz w:val="24"/>
+          <w:szCs w:val="24"/>
+          <w:lang w:val="en-US"/>
+        </w:rPr>
+        <w:lastRenderedPageBreak/>
+        <w:t xml:space="preserve">Name, </w:t>
       </w:r>
       <w:proofErr w:type="spellStart"/>
       <w:proofErr w:type="gramStart"/>
@@ -28121,7 +28297,6 @@
           <w:szCs w:val="24"/>
           <w:lang w:val="en-US"/>
         </w:rPr>
-        <w:lastRenderedPageBreak/>
         <w:t>Penjelasan</w:t>
       </w:r>
       <w:proofErr w:type="spellEnd"/>
@@ -29674,6 +29849,7 @@
           <w:szCs w:val="24"/>
           <w:lang w:val="en-US"/>
         </w:rPr>
+        <w:lastRenderedPageBreak/>
         <w:t>Penjelasan</w:t>
       </w:r>
       <w:proofErr w:type="spellEnd"/>
@@ -30847,7 +31023,6 @@
           <w:szCs w:val="24"/>
           <w:lang w:val="en-US"/>
         </w:rPr>
-        <w:lastRenderedPageBreak/>
         <w:t>Komponen</w:t>
       </w:r>
       <w:proofErr w:type="spellEnd"/>
@@ -32418,6 +32593,7 @@
           <w:szCs w:val="24"/>
           <w:lang w:val="en-US"/>
         </w:rPr>
+        <w:lastRenderedPageBreak/>
         <w:t>Tombol</w:t>
       </w:r>
       <w:proofErr w:type="spellEnd"/>
@@ -33649,16 +33825,7 @@
           <w:szCs w:val="24"/>
           <w:lang w:val="en-US"/>
         </w:rPr>
-        <w:t xml:space="preserve">, </w:t>
-      </w:r>
-      <w:r>
-        <w:rPr>
-          <w:sz w:val="24"/>
-          <w:szCs w:val="24"/>
-          <w:lang w:val="en-US"/>
-        </w:rPr>
-        <w:lastRenderedPageBreak/>
-        <w:t xml:space="preserve">Phone, Email, Address, Term_of_Payment, Status, </w:t>
+        <w:t xml:space="preserve">, Phone, Email, Address, Term_of_Payment, Status, </w:t>
       </w:r>
       <w:proofErr w:type="spellStart"/>
       <w:r>
@@ -34996,7 +35163,16 @@
           <w:szCs w:val="24"/>
           <w:lang w:val="en-US"/>
         </w:rPr>
-        <w:t xml:space="preserve"> edit </w:t>
+        <w:t xml:space="preserve"> </w:t>
+      </w:r>
+      <w:r>
+        <w:rPr>
+          <w:sz w:val="24"/>
+          <w:szCs w:val="24"/>
+          <w:lang w:val="en-US"/>
+        </w:rPr>
+        <w:lastRenderedPageBreak/>
+        <w:t xml:space="preserve">edit </w:t>
       </w:r>
       <w:proofErr w:type="spellStart"/>
       <w:r>

</xml_diff>

<commit_message>
feat: add Warehouse master (Master)
</commit_message>
<xml_diff>
--- a/blueprint/DRAFT_Blueprint_ERP_Master_Data_CWA.docx
+++ b/blueprint/DRAFT_Blueprint_ERP_Master_Data_CWA.docx
@@ -1039,6 +1039,12 @@
                 <w:sz w:val="24"/>
               </w:rPr>
             </w:pPr>
+            <w:r>
+              <w:rPr>
+                <w:sz w:val="24"/>
+              </w:rPr>
+              <w:t>PT CITRA WARNA ABADI</w:t>
+            </w:r>
           </w:p>
         </w:tc>
       </w:tr>

</xml_diff>